<commit_message>
region and RSA exchange
</commit_message>
<xml_diff>
--- a/Protocol.docx
+++ b/Protocol.docx
@@ -42,7 +42,15 @@
         <w:t>the beginning of each message,</w:t>
       </w:r>
       <w:r>
-        <w:t xml:space="preserve"> is a </w:t>
+        <w:t xml:space="preserve"> </w:t>
+      </w:r>
+      <w:proofErr w:type="gramStart"/>
+      <w:r>
+        <w:t>is</w:t>
+      </w:r>
+      <w:proofErr w:type="gramEnd"/>
+      <w:r>
+        <w:t xml:space="preserve"> a </w:t>
       </w:r>
       <w:r>
         <w:rPr>
@@ -77,13 +85,27 @@
         <w:rPr>
           <w:color w:val="0070C0"/>
         </w:rPr>
-        <w:t xml:space="preserve"> (8byte)</w:t>
-      </w:r>
+        <w:t xml:space="preserve"> (8</w:t>
+      </w:r>
+      <w:proofErr w:type="gramStart"/>
       <w:r>
         <w:rPr>
           <w:color w:val="0070C0"/>
         </w:rPr>
-        <w:t>(4char)</w:t>
+        <w:t>byte)</w:t>
+      </w:r>
+      <w:r>
+        <w:rPr>
+          <w:color w:val="0070C0"/>
+        </w:rPr>
+        <w:t>(</w:t>
+      </w:r>
+      <w:proofErr w:type="gramEnd"/>
+      <w:r>
+        <w:rPr>
+          <w:color w:val="0070C0"/>
+        </w:rPr>
+        <w:t>4char)</w:t>
       </w:r>
     </w:p>
     <w:p>
@@ -116,7 +138,15 @@
         <w:jc w:val="center"/>
       </w:pPr>
       <w:r>
-        <w:t>String is long in order to avoid accidental separation in case of a long file.</w:t>
+        <w:t xml:space="preserve">String is long </w:t>
+      </w:r>
+      <w:proofErr w:type="gramStart"/>
+      <w:r>
+        <w:t>in order to</w:t>
+      </w:r>
+      <w:proofErr w:type="gramEnd"/>
+      <w:r>
+        <w:t xml:space="preserve"> avoid accidental separation in case of a long file.</w:t>
       </w:r>
     </w:p>
     <w:p>
@@ -258,7 +288,7 @@
               <w:jc w:val="center"/>
             </w:pPr>
             <w:r>
-              <w:t>HELO</w:t>
+              <w:t>EROR</w:t>
             </w:r>
           </w:p>
         </w:tc>
@@ -271,7 +301,7 @@
               <w:jc w:val="center"/>
             </w:pPr>
             <w:r>
-              <w:t>SENDS SERVER PUBLIC RSA KEY</w:t>
+              <w:t>EITHER SIDE ANNOUNCES ERROR</w:t>
             </w:r>
           </w:p>
         </w:tc>
@@ -284,7 +314,7 @@
               <w:jc w:val="center"/>
             </w:pPr>
             <w:r>
-              <w:t>PUBLIC RSA KEY</w:t>
+              <w:t>ERROR CODE (CONSULT ERROR TABLE)</w:t>
             </w:r>
           </w:p>
         </w:tc>
@@ -297,7 +327,7 @@
               <w:jc w:val="center"/>
             </w:pPr>
             <w:r>
-              <w:t>CLIENT</w:t>
+              <w:t>BOTH</w:t>
             </w:r>
           </w:p>
         </w:tc>
@@ -312,7 +342,7 @@
               <w:jc w:val="center"/>
             </w:pPr>
             <w:r>
-              <w:t>AESK</w:t>
+              <w:t>HELO</w:t>
             </w:r>
           </w:p>
         </w:tc>
@@ -325,7 +355,7 @@
               <w:jc w:val="center"/>
             </w:pPr>
             <w:r>
-              <w:t>SENDS CLIENT AES KEY, ENCRYPTED USING CLIENT’S PUBLIC RSA KEY</w:t>
+              <w:t>SENDS SERVER PUBLIC RSA KEY</w:t>
             </w:r>
           </w:p>
         </w:tc>
@@ -338,7 +368,7 @@
               <w:jc w:val="center"/>
             </w:pPr>
             <w:r>
-              <w:t>KEY</w:t>
+              <w:t>PUBLIC RSA KEY</w:t>
             </w:r>
           </w:p>
         </w:tc>
@@ -351,7 +381,7 @@
               <w:jc w:val="center"/>
             </w:pPr>
             <w:r>
-              <w:t>SERVER</w:t>
+              <w:t>CLIENT</w:t>
             </w:r>
           </w:p>
         </w:tc>
@@ -365,6 +395,9 @@
             <w:pPr>
               <w:jc w:val="center"/>
             </w:pPr>
+            <w:r>
+              <w:t>AESK</w:t>
+            </w:r>
           </w:p>
         </w:tc>
         <w:tc>
@@ -375,6 +408,9 @@
             <w:pPr>
               <w:jc w:val="center"/>
             </w:pPr>
+            <w:r>
+              <w:t>SENDS CLIENT AES KEY, ENCRYPTED USING CLIENT’S PUBLIC RSA KEY</w:t>
+            </w:r>
           </w:p>
         </w:tc>
         <w:tc>
@@ -385,6 +421,9 @@
             <w:pPr>
               <w:jc w:val="center"/>
             </w:pPr>
+            <w:r>
+              <w:t>KEY</w:t>
+            </w:r>
           </w:p>
         </w:tc>
         <w:tc>
@@ -395,6 +434,9 @@
             <w:pPr>
               <w:jc w:val="center"/>
             </w:pPr>
+            <w:r>
+              <w:t>SERVER</w:t>
+            </w:r>
           </w:p>
         </w:tc>
       </w:tr>
@@ -642,6 +684,224 @@
         <w:tc>
           <w:tcPr>
             <w:tcW w:w="2338" w:type="dxa"/>
+          </w:tcPr>
+          <w:p>
+            <w:pPr>
+              <w:jc w:val="center"/>
+            </w:pPr>
+          </w:p>
+        </w:tc>
+      </w:tr>
+    </w:tbl>
+    <w:p>
+      <w:pPr>
+        <w:jc w:val="center"/>
+      </w:pPr>
+    </w:p>
+    <w:p>
+      <w:pPr>
+        <w:jc w:val="center"/>
+      </w:pPr>
+    </w:p>
+    <w:p>
+      <w:pPr>
+        <w:jc w:val="center"/>
+      </w:pPr>
+    </w:p>
+    <w:p>
+      <w:pPr>
+        <w:jc w:val="center"/>
+      </w:pPr>
+      <w:r>
+        <w:lastRenderedPageBreak/>
+        <w:t>ERROR CODE</w:t>
+      </w:r>
+      <w:r>
+        <w:t xml:space="preserve"> TABLE</w:t>
+      </w:r>
+      <w:r>
+        <w:t>:</w:t>
+      </w:r>
+    </w:p>
+    <w:tbl>
+      <w:tblPr>
+        <w:tblStyle w:val="TableGrid"/>
+        <w:tblW w:w="0" w:type="auto"/>
+        <w:jc w:val="center"/>
+        <w:tblLook w:val="04A0" w:firstRow="1" w:lastRow="0" w:firstColumn="1" w:lastColumn="0" w:noHBand="0" w:noVBand="1"/>
+      </w:tblPr>
+      <w:tblGrid>
+        <w:gridCol w:w="3116"/>
+        <w:gridCol w:w="3117"/>
+      </w:tblGrid>
+      <w:tr>
+        <w:trPr>
+          <w:jc w:val="center"/>
+        </w:trPr>
+        <w:tc>
+          <w:tcPr>
+            <w:tcW w:w="3116" w:type="dxa"/>
+            <w:shd w:val="clear" w:color="auto" w:fill="7F7F7F" w:themeFill="text1" w:themeFillTint="80"/>
+          </w:tcPr>
+          <w:p>
+            <w:pPr>
+              <w:jc w:val="center"/>
+            </w:pPr>
+            <w:r>
+              <w:t>CODE</w:t>
+            </w:r>
+          </w:p>
+        </w:tc>
+        <w:tc>
+          <w:tcPr>
+            <w:tcW w:w="3117" w:type="dxa"/>
+            <w:shd w:val="clear" w:color="auto" w:fill="7F7F7F" w:themeFill="text1" w:themeFillTint="80"/>
+          </w:tcPr>
+          <w:p>
+            <w:pPr>
+              <w:jc w:val="center"/>
+            </w:pPr>
+            <w:r>
+              <w:t>MEANING</w:t>
+            </w:r>
+          </w:p>
+        </w:tc>
+      </w:tr>
+      <w:tr>
+        <w:trPr>
+          <w:jc w:val="center"/>
+        </w:trPr>
+        <w:tc>
+          <w:tcPr>
+            <w:tcW w:w="3116" w:type="dxa"/>
+          </w:tcPr>
+          <w:p>
+            <w:pPr>
+              <w:jc w:val="center"/>
+            </w:pPr>
+            <w:r>
+              <w:t>001</w:t>
+            </w:r>
+          </w:p>
+        </w:tc>
+        <w:tc>
+          <w:tcPr>
+            <w:tcW w:w="3117" w:type="dxa"/>
+          </w:tcPr>
+          <w:p>
+            <w:pPr>
+              <w:jc w:val="center"/>
+            </w:pPr>
+            <w:r>
+              <w:t>BAD MESSAGE</w:t>
+            </w:r>
+          </w:p>
+        </w:tc>
+      </w:tr>
+      <w:tr>
+        <w:trPr>
+          <w:jc w:val="center"/>
+        </w:trPr>
+        <w:tc>
+          <w:tcPr>
+            <w:tcW w:w="3116" w:type="dxa"/>
+          </w:tcPr>
+          <w:p>
+            <w:pPr>
+              <w:jc w:val="center"/>
+            </w:pPr>
+            <w:r>
+              <w:t>002</w:t>
+            </w:r>
+          </w:p>
+        </w:tc>
+        <w:tc>
+          <w:tcPr>
+            <w:tcW w:w="3117" w:type="dxa"/>
+          </w:tcPr>
+          <w:p>
+            <w:pPr>
+              <w:jc w:val="center"/>
+            </w:pPr>
+          </w:p>
+        </w:tc>
+      </w:tr>
+      <w:tr>
+        <w:trPr>
+          <w:jc w:val="center"/>
+        </w:trPr>
+        <w:tc>
+          <w:tcPr>
+            <w:tcW w:w="3116" w:type="dxa"/>
+          </w:tcPr>
+          <w:p>
+            <w:pPr>
+              <w:jc w:val="center"/>
+            </w:pPr>
+            <w:r>
+              <w:t>003</w:t>
+            </w:r>
+          </w:p>
+        </w:tc>
+        <w:tc>
+          <w:tcPr>
+            <w:tcW w:w="3117" w:type="dxa"/>
+          </w:tcPr>
+          <w:p>
+            <w:pPr>
+              <w:jc w:val="center"/>
+            </w:pPr>
+          </w:p>
+        </w:tc>
+      </w:tr>
+      <w:tr>
+        <w:trPr>
+          <w:jc w:val="center"/>
+        </w:trPr>
+        <w:tc>
+          <w:tcPr>
+            <w:tcW w:w="3116" w:type="dxa"/>
+          </w:tcPr>
+          <w:p>
+            <w:pPr>
+              <w:jc w:val="center"/>
+            </w:pPr>
+            <w:r>
+              <w:t>004</w:t>
+            </w:r>
+          </w:p>
+        </w:tc>
+        <w:tc>
+          <w:tcPr>
+            <w:tcW w:w="3117" w:type="dxa"/>
+          </w:tcPr>
+          <w:p>
+            <w:pPr>
+              <w:jc w:val="center"/>
+            </w:pPr>
+          </w:p>
+        </w:tc>
+      </w:tr>
+      <w:tr>
+        <w:trPr>
+          <w:jc w:val="center"/>
+        </w:trPr>
+        <w:tc>
+          <w:tcPr>
+            <w:tcW w:w="3116" w:type="dxa"/>
+          </w:tcPr>
+          <w:p>
+            <w:pPr>
+              <w:jc w:val="center"/>
+            </w:pPr>
+            <w:r>
+              <w:t>005</w:t>
+            </w:r>
+          </w:p>
+        </w:tc>
+        <w:tc>
+          <w:tcPr>
+            <w:tcW w:w="3117" w:type="dxa"/>
           </w:tcPr>
           <w:p>
             <w:pPr>

</xml_diff>